<commit_message>
Update portfolio for latest resume
</commit_message>
<xml_diff>
--- a/assets/docs/Justin_Barczewski_Resume.docx
+++ b/assets/docs/Justin_Barczewski_Resume.docx
@@ -77,8 +77,37 @@
           <w:sz w:val="18"/>
           <w:szCs w:val="18"/>
         </w:rPr>
-        <w:t xml:space="preserve">  linkedin.com/in/justin-barczewski-542234149</w:t>
-      </w:r>
+        <w:t xml:space="preserve">  </w:t>
+      </w:r>
+      <w:hyperlink r:id="rId5" w:history="1">
+        <w:r>
+          <w:rPr>
+            <w:color w:val="2F5496"/>
+            <w:sz w:val="18"/>
+            <w:szCs w:val="18"/>
+            <w:u w:val="single" w:color="2F5496"/>
+          </w:rPr>
+          <w:t>LinkedIn</w:t>
+        </w:r>
+      </w:hyperlink>
+      <w:r>
+        <w:rPr>
+          <w:sz w:val="18"/>
+          <w:szCs w:val="18"/>
+        </w:rPr>
+        <w:t xml:space="preserve">  |  </w:t>
+      </w:r>
+      <w:hyperlink r:id="rId6" w:history="1">
+        <w:r>
+          <w:rPr>
+            <w:color w:val="2F5496"/>
+            <w:sz w:val="18"/>
+            <w:szCs w:val="18"/>
+            <w:u w:val="single" w:color="2F5496"/>
+          </w:rPr>
+          <w:t>Portfolio</w:t>
+        </w:r>
+      </w:hyperlink>
     </w:p>
     <w:p>
       <w:pPr>
@@ -105,7 +134,7 @@
         <w:spacing w:after="60" w:line="252" w:lineRule="auto"/>
       </w:pPr>
       <w:r>
-        <w:t>Educational leader and doctoral candidate in education (EdD, expected August 2026) specializing in higher education, instructional design, and adult learning, with 10+ years of experience developing and facilitating training that builds measurable knowledge, skills, and performance outcomes. Combines a scholar-practitioner foundation in grounded theory research, curriculum development, and learner assessment with enterprise project leadership, Agile/Scrum delivery, and data-informed decision-making. Certified ScrumMaster (CSM) with an active federal security clearance and a proven record leading cross-functional teams and knowledge-transfer initiatives across complex, high-stakes environments. Seeks to apply educational leadership and program-development expertise to advance teaching, learning, and organizational effectiveness in higher education.</w:t>
+        <w:t>Educational leader and doctoral candidate in education (EdD, expected August 2026) specializing in higher education, instructional design, and adult learning, with 10+ years of experience developing and facilitating training that builds measurable knowledge, skills, and performance outcomes. Scholar-practitioner grounded theory research, curriculum development, and learner assessment with enterprise project leadership, Agile/Scrum delivery, and data-informed decision-making. Certified ScrumMaster (CSM) with active federal security clearance. Experienced leading cross-functional teams and knowledge-transfer initiatives across complex, high-stakes environments. Seeks to apply educational leadership and program-development expertise to advance teaching, learning, and organizational effectiveness in higher education.</w:t>
       </w:r>
     </w:p>
     <w:p>
@@ -507,7 +536,7 @@
         <w:spacing w:after="60" w:line="252" w:lineRule="auto"/>
       </w:pPr>
       <w:r>
-        <w:t xml:space="preserve">Provide analytical and consulting support for large-scale public-sector IT operations across the Department of Veterans Affairs EHRM program, improving project tracking, issue management, and reporting for the enterprise transition of 170+ medical facilities from the legacy </w:t>
+        <w:t xml:space="preserve">Build stakeholder capability across the Department of Veterans Affairs EHRM program by designing training materials, job aids, and process documentation that equipped analysts and program staff to adopt new project tracking, issue-management, and reporting workflows during the enterprise transition of 170+ medical facilities from the legacy </w:t>
       </w:r>
       <w:proofErr w:type="spellStart"/>
       <w:r>
@@ -584,7 +613,7 @@
       </w:pPr>
       <w:r>
         <w:lastRenderedPageBreak/>
-        <w:t>Lead transition and knowledge-transfer activities, authoring handoff documentation, methodology artifacts, and standardized reporting workflows that preserve institutional knowledge and operational continuity across contract and team transitions.</w:t>
+        <w:t>Preserve institutional knowledge and operational continuity across contract and team transitions, authoring handoff documentation, methodology artifacts, and standardized reporting workflows that enabled incoming teams to sustain program deliverables without interruption.</w:t>
       </w:r>
     </w:p>
     <w:p>
@@ -1078,10 +1107,96 @@
 <file path=word/numbering.xml><?xml version="1.0" encoding="utf-8"?>
 <w:numbering xmlns:wpc="http://schemas.microsoft.com/office/word/2010/wordprocessingCanvas" xmlns:cx="http://schemas.microsoft.com/office/drawing/2014/chartex" xmlns:cx1="http://schemas.microsoft.com/office/drawing/2015/9/8/chartex" xmlns:cx2="http://schemas.microsoft.com/office/drawing/2015/10/21/chartex" xmlns:cx3="http://schemas.microsoft.com/office/drawing/2016/5/9/chartex" xmlns:cx4="http://schemas.microsoft.com/office/drawing/2016/5/10/chartex" xmlns:cx5="http://schemas.microsoft.com/office/drawing/2016/5/11/chartex" xmlns:cx6="http://schemas.microsoft.com/office/drawing/2016/5/12/chartex" xmlns:cx7="http://schemas.microsoft.com/office/drawing/2016/5/13/chartex" xmlns:cx8="http://schemas.microsoft.com/office/drawing/2016/5/14/chartex" xmlns:mc="http://schemas.openxmlformats.org/markup-compatibility/2006" xmlns:aink="http://schemas.microsoft.com/office/drawing/2016/ink" xmlns:am3d="http://schemas.microsoft.com/office/drawing/2017/model3d" xmlns:o="urn:schemas-microsoft-com:office:office" xmlns:oel="http://schemas.microsoft.com/office/2019/extlst" xmlns:r="http://schemas.openxmlformats.org/officeDocument/2006/relationships" xmlns:m="http://schemas.openxmlformats.org/officeDocument/2006/math" xmlns:v="urn:schemas-microsoft-com:vml" xmlns:wp14="http://schemas.microsoft.com/office/word/2010/wordprocessingDrawing" xmlns:wp="http://schemas.openxmlformats.org/drawingml/2006/wordprocessingDrawing" xmlns:w10="urn:schemas-microsoft-com:office:word" xmlns:w="http://schemas.openxmlformats.org/wordprocessingml/2006/main" xmlns:w14="http://schemas.microsoft.com/office/word/2010/wordml" xmlns:w15="http://schemas.microsoft.com/office/word/2012/wordml" xmlns:w16cex="http://schemas.microsoft.com/office/word/2018/wordml/cex" xmlns:w16cid="http://schemas.microsoft.com/office/word/2016/wordml/cid" xmlns:w16="http://schemas.microsoft.com/office/word/2018/wordml" xmlns:w16du="http://schemas.microsoft.com/office/word/2023/wordml/word16du" xmlns:w16sdtdh="http://schemas.microsoft.com/office/word/2020/wordml/sdtdatahash" xmlns:w16sdtfl="http://schemas.microsoft.com/office/word/2024/wordml/sdtformatlock" xmlns:w16se="http://schemas.microsoft.com/office/word/2015/wordml/symex" xmlns:wpg="http://schemas.microsoft.com/office/word/2010/wordprocessingGroup" xmlns:wpi="http://schemas.microsoft.com/office/word/2010/wordprocessingInk" xmlns:wne="http://schemas.microsoft.com/office/word/2006/wordml" xmlns:wps="http://schemas.microsoft.com/office/word/2010/wordprocessingShape" mc:Ignorable="w14 w15 w16se w16cid w16 w16cex w16sdtdh w16sdtfl w16du wp14">
   <w:abstractNum w:abstractNumId="0" w15:restartNumberingAfterBreak="0">
-    <w:nsid w:val="23813382"/>
+    <w:nsid w:val="19F054F2"/>
     <w:multiLevelType w:val="hybridMultilevel"/>
-    <w:tmpl w:val="9F0CFE7A"/>
-    <w:lvl w:ilvl="0" w:tplc="35C4FC9A">
+    <w:tmpl w:val="471A3E28"/>
+    <w:lvl w:ilvl="0" w:tplc="D1C2BE36">
+      <w:start w:val="1"/>
+      <w:numFmt w:val="bullet"/>
+      <w:lvlText w:val="●"/>
+      <w:lvlJc w:val="left"/>
+      <w:pPr>
+        <w:ind w:left="720" w:hanging="360"/>
+      </w:pPr>
+    </w:lvl>
+    <w:lvl w:ilvl="1" w:tplc="B128E790">
+      <w:start w:val="1"/>
+      <w:numFmt w:val="bullet"/>
+      <w:lvlText w:val="○"/>
+      <w:lvlJc w:val="left"/>
+      <w:pPr>
+        <w:ind w:left="1440" w:hanging="360"/>
+      </w:pPr>
+    </w:lvl>
+    <w:lvl w:ilvl="2" w:tplc="3ECC97F6">
+      <w:start w:val="1"/>
+      <w:numFmt w:val="bullet"/>
+      <w:lvlText w:val="■"/>
+      <w:lvlJc w:val="left"/>
+      <w:pPr>
+        <w:ind w:left="2160" w:hanging="360"/>
+      </w:pPr>
+    </w:lvl>
+    <w:lvl w:ilvl="3" w:tplc="5DD64772">
+      <w:start w:val="1"/>
+      <w:numFmt w:val="bullet"/>
+      <w:lvlText w:val="●"/>
+      <w:lvlJc w:val="left"/>
+      <w:pPr>
+        <w:ind w:left="2880" w:hanging="360"/>
+      </w:pPr>
+    </w:lvl>
+    <w:lvl w:ilvl="4" w:tplc="5F1C24B2">
+      <w:start w:val="1"/>
+      <w:numFmt w:val="bullet"/>
+      <w:lvlText w:val="○"/>
+      <w:lvlJc w:val="left"/>
+      <w:pPr>
+        <w:ind w:left="3600" w:hanging="360"/>
+      </w:pPr>
+    </w:lvl>
+    <w:lvl w:ilvl="5" w:tplc="301E5F14">
+      <w:start w:val="1"/>
+      <w:numFmt w:val="bullet"/>
+      <w:lvlText w:val="■"/>
+      <w:lvlJc w:val="left"/>
+      <w:pPr>
+        <w:ind w:left="4320" w:hanging="360"/>
+      </w:pPr>
+    </w:lvl>
+    <w:lvl w:ilvl="6" w:tplc="FD622F72">
+      <w:start w:val="1"/>
+      <w:numFmt w:val="bullet"/>
+      <w:lvlText w:val="●"/>
+      <w:lvlJc w:val="left"/>
+      <w:pPr>
+        <w:ind w:left="5040" w:hanging="360"/>
+      </w:pPr>
+    </w:lvl>
+    <w:lvl w:ilvl="7" w:tplc="A12CA084">
+      <w:start w:val="1"/>
+      <w:numFmt w:val="bullet"/>
+      <w:lvlText w:val="●"/>
+      <w:lvlJc w:val="left"/>
+      <w:pPr>
+        <w:ind w:left="5760" w:hanging="360"/>
+      </w:pPr>
+    </w:lvl>
+    <w:lvl w:ilvl="8" w:tplc="6AB07852">
+      <w:start w:val="1"/>
+      <w:numFmt w:val="bullet"/>
+      <w:lvlText w:val="●"/>
+      <w:lvlJc w:val="left"/>
+      <w:pPr>
+        <w:ind w:left="6480" w:hanging="360"/>
+      </w:pPr>
+    </w:lvl>
+  </w:abstractNum>
+  <w:abstractNum w:abstractNumId="1" w15:restartNumberingAfterBreak="0">
+    <w:nsid w:val="5CA578B6"/>
+    <w:multiLevelType w:val="hybridMultilevel"/>
+    <w:tmpl w:val="3FAE5E3C"/>
+    <w:lvl w:ilvl="0" w:tplc="8AB856B0">
       <w:start w:val="1"/>
       <w:numFmt w:val="bullet"/>
       <w:lvlText w:val="•"/>
@@ -1090,135 +1205,49 @@
         <w:ind w:left="274" w:hanging="187"/>
       </w:pPr>
     </w:lvl>
-    <w:lvl w:ilvl="1" w:tplc="4064B6D2">
+    <w:lvl w:ilvl="1" w:tplc="26141B9A">
       <w:numFmt w:val="decimal"/>
       <w:lvlText w:val=""/>
       <w:lvlJc w:val="left"/>
     </w:lvl>
-    <w:lvl w:ilvl="2" w:tplc="15664EC2">
+    <w:lvl w:ilvl="2" w:tplc="53CC2908">
       <w:numFmt w:val="decimal"/>
       <w:lvlText w:val=""/>
       <w:lvlJc w:val="left"/>
     </w:lvl>
-    <w:lvl w:ilvl="3" w:tplc="D920488C">
+    <w:lvl w:ilvl="3" w:tplc="9710CD72">
       <w:numFmt w:val="decimal"/>
       <w:lvlText w:val=""/>
       <w:lvlJc w:val="left"/>
     </w:lvl>
-    <w:lvl w:ilvl="4" w:tplc="97C00AA0">
+    <w:lvl w:ilvl="4" w:tplc="4B7646BA">
       <w:numFmt w:val="decimal"/>
       <w:lvlText w:val=""/>
       <w:lvlJc w:val="left"/>
     </w:lvl>
-    <w:lvl w:ilvl="5" w:tplc="02143B58">
+    <w:lvl w:ilvl="5" w:tplc="9DAAF824">
       <w:numFmt w:val="decimal"/>
       <w:lvlText w:val=""/>
       <w:lvlJc w:val="left"/>
     </w:lvl>
-    <w:lvl w:ilvl="6" w:tplc="1C987BBE">
+    <w:lvl w:ilvl="6" w:tplc="0D8AC4FA">
       <w:numFmt w:val="decimal"/>
       <w:lvlText w:val=""/>
       <w:lvlJc w:val="left"/>
     </w:lvl>
-    <w:lvl w:ilvl="7" w:tplc="9CC25F44">
+    <w:lvl w:ilvl="7" w:tplc="2C4CD178">
       <w:numFmt w:val="decimal"/>
       <w:lvlText w:val=""/>
       <w:lvlJc w:val="left"/>
     </w:lvl>
-    <w:lvl w:ilvl="8" w:tplc="477A6B12">
+    <w:lvl w:ilvl="8" w:tplc="910E2E36">
       <w:numFmt w:val="decimal"/>
       <w:lvlText w:val=""/>
       <w:lvlJc w:val="left"/>
     </w:lvl>
   </w:abstractNum>
-  <w:abstractNum w:abstractNumId="1" w15:restartNumberingAfterBreak="0">
-    <w:nsid w:val="4B7C12A0"/>
-    <w:multiLevelType w:val="hybridMultilevel"/>
-    <w:tmpl w:val="E11CAA2E"/>
-    <w:lvl w:ilvl="0" w:tplc="261ECC6A">
-      <w:start w:val="1"/>
-      <w:numFmt w:val="bullet"/>
-      <w:lvlText w:val="●"/>
-      <w:lvlJc w:val="left"/>
-      <w:pPr>
-        <w:ind w:left="720" w:hanging="360"/>
-      </w:pPr>
-    </w:lvl>
-    <w:lvl w:ilvl="1" w:tplc="A3A20572">
-      <w:start w:val="1"/>
-      <w:numFmt w:val="bullet"/>
-      <w:lvlText w:val="○"/>
-      <w:lvlJc w:val="left"/>
-      <w:pPr>
-        <w:ind w:left="1440" w:hanging="360"/>
-      </w:pPr>
-    </w:lvl>
-    <w:lvl w:ilvl="2" w:tplc="625604AA">
-      <w:start w:val="1"/>
-      <w:numFmt w:val="bullet"/>
-      <w:lvlText w:val="■"/>
-      <w:lvlJc w:val="left"/>
-      <w:pPr>
-        <w:ind w:left="2160" w:hanging="360"/>
-      </w:pPr>
-    </w:lvl>
-    <w:lvl w:ilvl="3" w:tplc="4F140C70">
-      <w:start w:val="1"/>
-      <w:numFmt w:val="bullet"/>
-      <w:lvlText w:val="●"/>
-      <w:lvlJc w:val="left"/>
-      <w:pPr>
-        <w:ind w:left="2880" w:hanging="360"/>
-      </w:pPr>
-    </w:lvl>
-    <w:lvl w:ilvl="4" w:tplc="A53806CE">
-      <w:start w:val="1"/>
-      <w:numFmt w:val="bullet"/>
-      <w:lvlText w:val="○"/>
-      <w:lvlJc w:val="left"/>
-      <w:pPr>
-        <w:ind w:left="3600" w:hanging="360"/>
-      </w:pPr>
-    </w:lvl>
-    <w:lvl w:ilvl="5" w:tplc="4546E886">
-      <w:start w:val="1"/>
-      <w:numFmt w:val="bullet"/>
-      <w:lvlText w:val="■"/>
-      <w:lvlJc w:val="left"/>
-      <w:pPr>
-        <w:ind w:left="4320" w:hanging="360"/>
-      </w:pPr>
-    </w:lvl>
-    <w:lvl w:ilvl="6" w:tplc="F12EF0FC">
-      <w:start w:val="1"/>
-      <w:numFmt w:val="bullet"/>
-      <w:lvlText w:val="●"/>
-      <w:lvlJc w:val="left"/>
-      <w:pPr>
-        <w:ind w:left="5040" w:hanging="360"/>
-      </w:pPr>
-    </w:lvl>
-    <w:lvl w:ilvl="7" w:tplc="77904D64">
-      <w:start w:val="1"/>
-      <w:numFmt w:val="bullet"/>
-      <w:lvlText w:val="●"/>
-      <w:lvlJc w:val="left"/>
-      <w:pPr>
-        <w:ind w:left="5760" w:hanging="360"/>
-      </w:pPr>
-    </w:lvl>
-    <w:lvl w:ilvl="8" w:tplc="6FE8AB8C">
-      <w:start w:val="1"/>
-      <w:numFmt w:val="bullet"/>
-      <w:lvlText w:val="●"/>
-      <w:lvlJc w:val="left"/>
-      <w:pPr>
-        <w:ind w:left="6480" w:hanging="360"/>
-      </w:pPr>
-    </w:lvl>
-  </w:abstractNum>
-  <w:num w:numId="1" w16cid:durableId="2102873424">
-    <w:abstractNumId w:val="1"/>
+  <w:num w:numId="1" w16cid:durableId="60254053">
+    <w:abstractNumId w:val="0"/>
     <w:lvlOverride w:ilvl="0">
       <w:startOverride w:val="1"/>
     </w:lvlOverride>
@@ -1815,6 +1844,66 @@
       <w:szCs w:val="20"/>
     </w:rPr>
   </w:style>
+  <w:style w:type="paragraph" w:styleId="Revision">
+    <w:name w:val="Revision"/>
+    <w:hidden/>
+    <w:uiPriority w:val="99"/>
+    <w:semiHidden/>
+    <w:rsid w:val="007759DF"/>
+  </w:style>
+  <w:style w:type="character" w:styleId="CommentReference">
+    <w:name w:val="annotation reference"/>
+    <w:basedOn w:val="DefaultParagraphFont"/>
+    <w:uiPriority w:val="99"/>
+    <w:semiHidden/>
+    <w:unhideWhenUsed/>
+    <w:rsid w:val="007759DF"/>
+    <w:rPr>
+      <w:sz w:val="16"/>
+      <w:szCs w:val="16"/>
+    </w:rPr>
+  </w:style>
+  <w:style w:type="paragraph" w:styleId="CommentText">
+    <w:name w:val="annotation text"/>
+    <w:basedOn w:val="Normal"/>
+    <w:link w:val="CommentTextChar"/>
+    <w:uiPriority w:val="99"/>
+    <w:unhideWhenUsed/>
+    <w:rsid w:val="007759DF"/>
+  </w:style>
+  <w:style w:type="character" w:customStyle="1" w:styleId="CommentTextChar">
+    <w:name w:val="Comment Text Char"/>
+    <w:basedOn w:val="DefaultParagraphFont"/>
+    <w:link w:val="CommentText"/>
+    <w:uiPriority w:val="99"/>
+    <w:rsid w:val="007759DF"/>
+  </w:style>
+  <w:style w:type="paragraph" w:styleId="CommentSubject">
+    <w:name w:val="annotation subject"/>
+    <w:basedOn w:val="CommentText"/>
+    <w:next w:val="CommentText"/>
+    <w:link w:val="CommentSubjectChar"/>
+    <w:uiPriority w:val="99"/>
+    <w:semiHidden/>
+    <w:unhideWhenUsed/>
+    <w:rsid w:val="007759DF"/>
+    <w:rPr>
+      <w:b/>
+      <w:bCs/>
+    </w:rPr>
+  </w:style>
+  <w:style w:type="character" w:customStyle="1" w:styleId="CommentSubjectChar">
+    <w:name w:val="Comment Subject Char"/>
+    <w:basedOn w:val="CommentTextChar"/>
+    <w:link w:val="CommentSubject"/>
+    <w:uiPriority w:val="99"/>
+    <w:semiHidden/>
+    <w:rsid w:val="007759DF"/>
+    <w:rPr>
+      <w:b/>
+      <w:bCs/>
+    </w:rPr>
+  </w:style>
 </w:styles>
 </file>
 

</xml_diff>